<commit_message>
Report Appendix B: knowledge-anchored integration + residual discovery (basal axis) + verification
Syncs the canonical 2015-vs-2026 report with the recent rounds: knowledge-anchored integration (a 0-param
proliferation prior scores 0.919 and gating data reaches 0.947, the first clean super-additive gain; the
Horvath clock case where the textbook suffices), and the knowledge-anchored residual discovery that recovers
the basal/lineage axis beyond proliferation, verified held-out + stable + label-specific.
</commit_message>
<xml_diff>
--- a/reports/GSE57577_2015_vs_2026_report.docx
+++ b/reports/GSE57577_2015_vs_2026_report.docx
@@ -10345,6 +10345,469 @@
       </w:pPr>
       <w:r>
         <w:t xml:space="preserve">This is the first real, non-synthetic endpoint where methylation beats RNA. On normal-adjacent tissue the clock score reaches AUROC 0.941 vs RNA 0.908, winning in 10/10 cross-validation seeds (clock-vs-age Pearson r = 0.89), while a matched random-CpG set scores only 0.678 — so the +0.26 advantage is the curation, not extra features — and auto_integrate selects the clock methylation as the anchor, directly refuting any 'RNA-biased' reading of the method. In tumour the clock is disrupted (r = 0.32) so RNA wins and the anchor reverts to RNA, exactly as the biology dictates. Two honest caveats: there is still no super-additive fusion gain even here (RNA adds about zero on the clock residual, auto delta = -0.003, within small-sample noise), and the clock is an externally pre-trained predictor — which is the point: curated biomarkers, not raw genome-wide methylation, carry the signal RNA cannot. Runner reports/dmoi_fusion_gain.py; recorded in fusion_gain_results.csv with CI guard test_fusion_gain_guard.</w:t>
+      </w:r>
+    </w:p>
+    <w:p>
+      <w:pPr>
+        <w:pStyle w:val="Heading2"/>
+      </w:pPr>
+      <w:r>
+        <w:t xml:space="preserve">Knowledge-anchored integration and residual discovery (beyond the textbook)</w:t>
+      </w:r>
+    </w:p>
+    <w:p>
+      <w:pPr>
+        <w:spacing w:after="120"/>
+      </w:pPr>
+      <w:r>
+        <w:t xml:space="preserve">A further generalisation anchors not on a data modality but on FIXED textbook biology -- a curated gene signature or a published clock with zero trained parameters -- and gates the genome-wide data onto its residual, so the integrator is never below established knowledge and the gate answers 'does the data add anything beyond the textbook?'. Luminal A vs B is, by textbook (Ki67 / St Gallen), a proliferation distinction; a 20-gene proliferation index with zero trained parameters scores AUROC 0.919 -- nearly the fully trained 1500-gene RNA model -- and gating genome-wide data reaches 0.947, the first clean super-additive gain in this work (with the Horvath clock the textbook already suffices and data adds ~0):</w:t>
+      </w:r>
+    </w:p>
+    <w:tbl>
+      <w:tblPr>
+        <w:tblW w:type="dxa" w:w="9360"/>
+        <w:tblBorders>
+          <w:top w:val="single" w:color="auto" w:sz="4"/>
+          <w:left w:val="single" w:color="auto" w:sz="4"/>
+          <w:bottom w:val="single" w:color="auto" w:sz="4"/>
+          <w:right w:val="single" w:color="auto" w:sz="4"/>
+          <w:insideH w:val="single" w:color="auto" w:sz="4"/>
+          <w:insideV w:val="single" w:color="auto" w:sz="4"/>
+        </w:tblBorders>
+      </w:tblPr>
+      <w:tblGrid>
+        <w:gridCol w:w="2300"/>
+        <w:gridCol w:w="2500"/>
+        <w:gridCol w:w="1300"/>
+        <w:gridCol w:w="1300"/>
+        <w:gridCol w:w="1960"/>
+      </w:tblGrid>
+      <w:tr>
+        <w:trPr>
+          <w:tblHeader/>
+        </w:trPr>
+        <w:tc>
+          <w:tcPr>
+            <w:tcW w:type="dxa" w:w="2300"/>
+            <w:tcBorders>
+              <w:top w:val="single" w:color="BBBBBB" w:sz="1"/>
+              <w:left w:val="single" w:color="BBBBBB" w:sz="1"/>
+              <w:bottom w:val="single" w:color="BBBBBB" w:sz="1"/>
+              <w:right w:val="single" w:color="BBBBBB" w:sz="1"/>
+            </w:tcBorders>
+            <w:shd w:fill="1F3B5B" w:val="clear"/>
+            <w:tcMar>
+              <w:top w:type="dxa" w:w="80"/>
+              <w:left w:type="dxa" w:w="120"/>
+              <w:bottom w:type="dxa" w:w="80"/>
+              <w:right w:type="dxa" w:w="120"/>
+            </w:tcMar>
+          </w:tcPr>
+          <w:p>
+            <w:r>
+              <w:rPr>
+                <w:b/>
+                <w:bCs/>
+                <w:color w:val="FFFFFF"/>
+              </w:rPr>
+              <w:t xml:space="preserve">Endpoint</w:t>
+            </w:r>
+          </w:p>
+        </w:tc>
+        <w:tc>
+          <w:tcPr>
+            <w:tcW w:type="dxa" w:w="2500"/>
+            <w:tcBorders>
+              <w:top w:val="single" w:color="BBBBBB" w:sz="1"/>
+              <w:left w:val="single" w:color="BBBBBB" w:sz="1"/>
+              <w:bottom w:val="single" w:color="BBBBBB" w:sz="1"/>
+              <w:right w:val="single" w:color="BBBBBB" w:sz="1"/>
+            </w:tcBorders>
+            <w:shd w:fill="1F3B5B" w:val="clear"/>
+            <w:tcMar>
+              <w:top w:type="dxa" w:w="80"/>
+              <w:left w:type="dxa" w:w="120"/>
+              <w:bottom w:type="dxa" w:w="80"/>
+              <w:right w:type="dxa" w:w="120"/>
+            </w:tcMar>
+          </w:tcPr>
+          <w:p>
+            <w:r>
+              <w:rPr>
+                <w:b/>
+                <w:bCs/>
+                <w:color w:val="FFFFFF"/>
+              </w:rPr>
+              <w:t xml:space="preserve">Textbook anchor (0 params)</w:t>
+            </w:r>
+          </w:p>
+        </w:tc>
+        <w:tc>
+          <w:tcPr>
+            <w:tcW w:type="dxa" w:w="1300"/>
+            <w:tcBorders>
+              <w:top w:val="single" w:color="BBBBBB" w:sz="1"/>
+              <w:left w:val="single" w:color="BBBBBB" w:sz="1"/>
+              <w:bottom w:val="single" w:color="BBBBBB" w:sz="1"/>
+              <w:right w:val="single" w:color="BBBBBB" w:sz="1"/>
+            </w:tcBorders>
+            <w:shd w:fill="1F3B5B" w:val="clear"/>
+            <w:tcMar>
+              <w:top w:type="dxa" w:w="80"/>
+              <w:left w:type="dxa" w:w="120"/>
+              <w:bottom w:type="dxa" w:w="80"/>
+              <w:right w:type="dxa" w:w="120"/>
+            </w:tcMar>
+          </w:tcPr>
+          <w:p>
+            <w:r>
+              <w:rPr>
+                <w:b/>
+                <w:bCs/>
+                <w:color w:val="FFFFFF"/>
+              </w:rPr>
+              <w:t xml:space="preserve">anchor</w:t>
+            </w:r>
+          </w:p>
+        </w:tc>
+        <w:tc>
+          <w:tcPr>
+            <w:tcW w:type="dxa" w:w="1300"/>
+            <w:tcBorders>
+              <w:top w:val="single" w:color="BBBBBB" w:sz="1"/>
+              <w:left w:val="single" w:color="BBBBBB" w:sz="1"/>
+              <w:bottom w:val="single" w:color="BBBBBB" w:sz="1"/>
+              <w:right w:val="single" w:color="BBBBBB" w:sz="1"/>
+            </w:tcBorders>
+            <w:shd w:fill="1F3B5B" w:val="clear"/>
+            <w:tcMar>
+              <w:top w:type="dxa" w:w="80"/>
+              <w:left w:type="dxa" w:w="120"/>
+              <w:bottom w:type="dxa" w:w="80"/>
+              <w:right w:type="dxa" w:w="120"/>
+            </w:tcMar>
+          </w:tcPr>
+          <w:p>
+            <w:r>
+              <w:rPr>
+                <w:b/>
+                <w:bCs/>
+                <w:color w:val="FFFFFF"/>
+              </w:rPr>
+              <w:t xml:space="preserve">+ gated data</w:t>
+            </w:r>
+          </w:p>
+        </w:tc>
+        <w:tc>
+          <w:tcPr>
+            <w:tcW w:type="dxa" w:w="1960"/>
+            <w:tcBorders>
+              <w:top w:val="single" w:color="BBBBBB" w:sz="1"/>
+              <w:left w:val="single" w:color="BBBBBB" w:sz="1"/>
+              <w:bottom w:val="single" w:color="BBBBBB" w:sz="1"/>
+              <w:right w:val="single" w:color="BBBBBB" w:sz="1"/>
+            </w:tcBorders>
+            <w:shd w:fill="1F3B5B" w:val="clear"/>
+            <w:tcMar>
+              <w:top w:type="dxa" w:w="80"/>
+              <w:left w:type="dxa" w:w="120"/>
+              <w:bottom w:type="dxa" w:w="80"/>
+              <w:right w:type="dxa" w:w="120"/>
+            </w:tcMar>
+          </w:tcPr>
+          <w:p>
+            <w:r>
+              <w:rPr>
+                <w:b/>
+                <w:bCs/>
+                <w:color w:val="FFFFFF"/>
+              </w:rPr>
+              <w:t xml:space="preserve">Δ</w:t>
+            </w:r>
+          </w:p>
+        </w:tc>
+      </w:tr>
+      <w:tr>
+        <w:tc>
+          <w:tcPr>
+            <w:tcW w:type="dxa" w:w="2300"/>
+            <w:tcBorders>
+              <w:top w:val="single" w:color="BBBBBB" w:sz="1"/>
+              <w:left w:val="single" w:color="BBBBBB" w:sz="1"/>
+              <w:bottom w:val="single" w:color="BBBBBB" w:sz="1"/>
+              <w:right w:val="single" w:color="BBBBBB" w:sz="1"/>
+            </w:tcBorders>
+            <w:shd w:fill="F4F8FB" w:val="clear"/>
+            <w:tcMar>
+              <w:top w:type="dxa" w:w="80"/>
+              <w:left w:type="dxa" w:w="120"/>
+              <w:bottom w:type="dxa" w:w="80"/>
+              <w:right w:type="dxa" w:w="120"/>
+            </w:tcMar>
+          </w:tcPr>
+          <w:p>
+            <w:r>
+              <w:rPr>
+                <w:b w:val="false"/>
+                <w:bCs w:val="false"/>
+              </w:rPr>
+              <w:t xml:space="preserve">LumA vs LumB</w:t>
+            </w:r>
+          </w:p>
+        </w:tc>
+        <w:tc>
+          <w:tcPr>
+            <w:tcW w:type="dxa" w:w="2500"/>
+            <w:tcBorders>
+              <w:top w:val="single" w:color="BBBBBB" w:sz="1"/>
+              <w:left w:val="single" w:color="BBBBBB" w:sz="1"/>
+              <w:bottom w:val="single" w:color="BBBBBB" w:sz="1"/>
+              <w:right w:val="single" w:color="BBBBBB" w:sz="1"/>
+            </w:tcBorders>
+            <w:shd w:fill="F4F8FB" w:val="clear"/>
+            <w:tcMar>
+              <w:top w:type="dxa" w:w="80"/>
+              <w:left w:type="dxa" w:w="120"/>
+              <w:bottom w:type="dxa" w:w="80"/>
+              <w:right w:type="dxa" w:w="120"/>
+            </w:tcMar>
+          </w:tcPr>
+          <w:p>
+            <w:r>
+              <w:rPr>
+                <w:b w:val="false"/>
+                <w:bCs w:val="false"/>
+              </w:rPr>
+              <w:t xml:space="preserve">proliferation index (20 genes)</w:t>
+            </w:r>
+          </w:p>
+        </w:tc>
+        <w:tc>
+          <w:tcPr>
+            <w:tcW w:type="dxa" w:w="1300"/>
+            <w:tcBorders>
+              <w:top w:val="single" w:color="BBBBBB" w:sz="1"/>
+              <w:left w:val="single" w:color="BBBBBB" w:sz="1"/>
+              <w:bottom w:val="single" w:color="BBBBBB" w:sz="1"/>
+              <w:right w:val="single" w:color="BBBBBB" w:sz="1"/>
+            </w:tcBorders>
+            <w:shd w:fill="F4F8FB" w:val="clear"/>
+            <w:tcMar>
+              <w:top w:type="dxa" w:w="80"/>
+              <w:left w:type="dxa" w:w="120"/>
+              <w:bottom w:type="dxa" w:w="80"/>
+              <w:right w:type="dxa" w:w="120"/>
+            </w:tcMar>
+          </w:tcPr>
+          <w:p>
+            <w:r>
+              <w:rPr>
+                <w:b w:val="false"/>
+                <w:bCs w:val="false"/>
+              </w:rPr>
+              <w:t xml:space="preserve">0.919</w:t>
+            </w:r>
+          </w:p>
+        </w:tc>
+        <w:tc>
+          <w:tcPr>
+            <w:tcW w:type="dxa" w:w="1300"/>
+            <w:tcBorders>
+              <w:top w:val="single" w:color="BBBBBB" w:sz="1"/>
+              <w:left w:val="single" w:color="BBBBBB" w:sz="1"/>
+              <w:bottom w:val="single" w:color="BBBBBB" w:sz="1"/>
+              <w:right w:val="single" w:color="BBBBBB" w:sz="1"/>
+            </w:tcBorders>
+            <w:shd w:fill="F4F8FB" w:val="clear"/>
+            <w:tcMar>
+              <w:top w:type="dxa" w:w="80"/>
+              <w:left w:type="dxa" w:w="120"/>
+              <w:bottom w:type="dxa" w:w="80"/>
+              <w:right w:type="dxa" w:w="120"/>
+            </w:tcMar>
+          </w:tcPr>
+          <w:p>
+            <w:r>
+              <w:rPr>
+                <w:b w:val="false"/>
+                <w:bCs w:val="false"/>
+              </w:rPr>
+              <w:t xml:space="preserve">0.947</w:t>
+            </w:r>
+          </w:p>
+        </w:tc>
+        <w:tc>
+          <w:tcPr>
+            <w:tcW w:type="dxa" w:w="1960"/>
+            <w:tcBorders>
+              <w:top w:val="single" w:color="BBBBBB" w:sz="1"/>
+              <w:left w:val="single" w:color="BBBBBB" w:sz="1"/>
+              <w:bottom w:val="single" w:color="BBBBBB" w:sz="1"/>
+              <w:right w:val="single" w:color="BBBBBB" w:sz="1"/>
+            </w:tcBorders>
+            <w:shd w:fill="F4F8FB" w:val="clear"/>
+            <w:tcMar>
+              <w:top w:type="dxa" w:w="80"/>
+              <w:left w:type="dxa" w:w="120"/>
+              <w:bottom w:type="dxa" w:w="80"/>
+              <w:right w:type="dxa" w:w="120"/>
+            </w:tcMar>
+          </w:tcPr>
+          <w:p>
+            <w:r>
+              <w:rPr>
+                <w:b w:val="false"/>
+                <w:bCs w:val="false"/>
+              </w:rPr>
+              <w:t xml:space="preserve">+0.029</w:t>
+            </w:r>
+          </w:p>
+        </w:tc>
+      </w:tr>
+      <w:tr>
+        <w:tc>
+          <w:tcPr>
+            <w:tcW w:type="dxa" w:w="2300"/>
+            <w:tcBorders>
+              <w:top w:val="single" w:color="BBBBBB" w:sz="1"/>
+              <w:left w:val="single" w:color="BBBBBB" w:sz="1"/>
+              <w:bottom w:val="single" w:color="BBBBBB" w:sz="1"/>
+              <w:right w:val="single" w:color="BBBBBB" w:sz="1"/>
+            </w:tcBorders>
+            <w:shd w:fill="F4F8FB" w:val="clear"/>
+            <w:tcMar>
+              <w:top w:type="dxa" w:w="80"/>
+              <w:left w:type="dxa" w:w="120"/>
+              <w:bottom w:type="dxa" w:w="80"/>
+              <w:right w:type="dxa" w:w="120"/>
+            </w:tcMar>
+          </w:tcPr>
+          <w:p>
+            <w:r>
+              <w:rPr>
+                <w:b w:val="false"/>
+                <w:bCs w:val="false"/>
+              </w:rPr>
+              <w:t xml:space="preserve">normal-tissue age</w:t>
+            </w:r>
+          </w:p>
+        </w:tc>
+        <w:tc>
+          <w:tcPr>
+            <w:tcW w:type="dxa" w:w="2500"/>
+            <w:tcBorders>
+              <w:top w:val="single" w:color="BBBBBB" w:sz="1"/>
+              <w:left w:val="single" w:color="BBBBBB" w:sz="1"/>
+              <w:bottom w:val="single" w:color="BBBBBB" w:sz="1"/>
+              <w:right w:val="single" w:color="BBBBBB" w:sz="1"/>
+            </w:tcBorders>
+            <w:shd w:fill="F4F8FB" w:val="clear"/>
+            <w:tcMar>
+              <w:top w:type="dxa" w:w="80"/>
+              <w:left w:type="dxa" w:w="120"/>
+              <w:bottom w:type="dxa" w:w="80"/>
+              <w:right w:type="dxa" w:w="120"/>
+            </w:tcMar>
+          </w:tcPr>
+          <w:p>
+            <w:r>
+              <w:rPr>
+                <w:b w:val="false"/>
+                <w:bCs w:val="false"/>
+              </w:rPr>
+              <w:t xml:space="preserve">Horvath clock (353 CpGs)</w:t>
+            </w:r>
+          </w:p>
+        </w:tc>
+        <w:tc>
+          <w:tcPr>
+            <w:tcW w:type="dxa" w:w="1300"/>
+            <w:tcBorders>
+              <w:top w:val="single" w:color="BBBBBB" w:sz="1"/>
+              <w:left w:val="single" w:color="BBBBBB" w:sz="1"/>
+              <w:bottom w:val="single" w:color="BBBBBB" w:sz="1"/>
+              <w:right w:val="single" w:color="BBBBBB" w:sz="1"/>
+            </w:tcBorders>
+            <w:shd w:fill="F4F8FB" w:val="clear"/>
+            <w:tcMar>
+              <w:top w:type="dxa" w:w="80"/>
+              <w:left w:type="dxa" w:w="120"/>
+              <w:bottom w:type="dxa" w:w="80"/>
+              <w:right w:type="dxa" w:w="120"/>
+            </w:tcMar>
+          </w:tcPr>
+          <w:p>
+            <w:r>
+              <w:rPr>
+                <w:b w:val="false"/>
+                <w:bCs w:val="false"/>
+              </w:rPr>
+              <w:t xml:space="preserve">0.947</w:t>
+            </w:r>
+          </w:p>
+        </w:tc>
+        <w:tc>
+          <w:tcPr>
+            <w:tcW w:type="dxa" w:w="1300"/>
+            <w:tcBorders>
+              <w:top w:val="single" w:color="BBBBBB" w:sz="1"/>
+              <w:left w:val="single" w:color="BBBBBB" w:sz="1"/>
+              <w:bottom w:val="single" w:color="BBBBBB" w:sz="1"/>
+              <w:right w:val="single" w:color="BBBBBB" w:sz="1"/>
+            </w:tcBorders>
+            <w:shd w:fill="F4F8FB" w:val="clear"/>
+            <w:tcMar>
+              <w:top w:type="dxa" w:w="80"/>
+              <w:left w:type="dxa" w:w="120"/>
+              <w:bottom w:type="dxa" w:w="80"/>
+              <w:right w:type="dxa" w:w="120"/>
+            </w:tcMar>
+          </w:tcPr>
+          <w:p>
+            <w:r>
+              <w:rPr>
+                <w:b w:val="false"/>
+                <w:bCs w:val="false"/>
+              </w:rPr>
+              <w:t xml:space="preserve">0.942</w:t>
+            </w:r>
+          </w:p>
+        </w:tc>
+        <w:tc>
+          <w:tcPr>
+            <w:tcW w:type="dxa" w:w="1960"/>
+            <w:tcBorders>
+              <w:top w:val="single" w:color="BBBBBB" w:sz="1"/>
+              <w:left w:val="single" w:color="BBBBBB" w:sz="1"/>
+              <w:bottom w:val="single" w:color="BBBBBB" w:sz="1"/>
+              <w:right w:val="single" w:color="BBBBBB" w:sz="1"/>
+            </w:tcBorders>
+            <w:shd w:fill="F4F8FB" w:val="clear"/>
+            <w:tcMar>
+              <w:top w:type="dxa" w:w="80"/>
+              <w:left w:type="dxa" w:w="120"/>
+              <w:bottom w:type="dxa" w:w="80"/>
+              <w:right w:type="dxa" w:w="120"/>
+            </w:tcMar>
+          </w:tcPr>
+          <w:p>
+            <w:r>
+              <w:rPr>
+                <w:b w:val="false"/>
+                <w:bCs w:val="false"/>
+              </w:rPr>
+              <w:t xml:space="preserve">−0.003</w:t>
+            </w:r>
+          </w:p>
+        </w:tc>
+      </w:tr>
+    </w:tbl>
+    <w:p>
+      <w:pPr>
+        <w:spacing w:after="120"/>
+      </w:pPr>
+      <w:r>
+        <w:t xml:space="preserve">Anchoring on the fixed proliferation prior and mining the noise-gated residual then surfaces, as the top anchor-orthogonal genes, the classic BASAL / squamous-lineage axis (KRT5/14/17/6B, TP63, DSG3/DSC3, SOX10, COL17A1, KLK5/7/8) -- beyond the textbook 'LumA/B = proliferation' the data recovers a coherent lineage axis. It was verified three ways: selecting the panel on a training split and scoring it on a held-out test still beats random panels in 10/10 splits (so it is not selection leakage), the basal core recurs in 10/10 splits, and under permuted labels the advantage collapses (real +0.021 vs all-negative permutations) -- so the method recovers the axis only when the signal is real. Honest scope: the predictive gain is modest; the method's value is interpretable discovery -- separate the known, keep the real new. Packaged as omniomics.multiomics.knowledge_anchored_integrate and anchored_residual_discovery; runners reports/dmoi_knowledge_anchor.py and reports/dmoi_residual_discovery.py.</w:t>
       </w:r>
     </w:p>
     <w:sectPr>

</xml_diff>

<commit_message>
Report Appendix B: discovery generalisation across 3 anchors (LumA/B, HER2, ER)
</commit_message>
<xml_diff>
--- a/reports/GSE57577_2015_vs_2026_report.docx
+++ b/reports/GSE57577_2015_vs_2026_report.docx
@@ -10808,6 +10808,606 @@
       </w:pPr>
       <w:r>
         <w:t xml:space="preserve">Anchoring on the fixed proliferation prior and mining the noise-gated residual then surfaces, as the top anchor-orthogonal genes, the classic BASAL / squamous-lineage axis (KRT5/14/17/6B, TP63, DSG3/DSC3, SOX10, COL17A1, KLK5/7/8) -- beyond the textbook 'LumA/B = proliferation' the data recovers a coherent lineage axis. It was verified three ways: selecting the panel on a training split and scoring it on a held-out test still beats random panels in 10/10 splits (so it is not selection leakage), the basal core recurs in 10/10 splits, and under permuted labels the advantage collapses (real +0.021 vs all-negative permutations) -- so the method recovers the axis only when the signal is real. Honest scope: the predictive gain is modest; the method's value is interpretable discovery -- separate the known, keep the real new. Packaged as omniomics.multiomics.knowledge_anchored_integrate and anchored_residual_discovery; runners reports/dmoi_knowledge_anchor.py and reports/dmoi_residual_discovery.py.</w:t>
+      </w:r>
+    </w:p>
+    <w:p>
+      <w:pPr>
+        <w:pStyle w:val="Heading2"/>
+      </w:pPr>
+      <w:r>
+        <w:t xml:space="preserve">Generalisation of the discovery method across three anchors</w:t>
+      </w:r>
+    </w:p>
+    <w:p>
+      <w:pPr>
+        <w:spacing w:after="120"/>
+      </w:pPr>
+      <w:r>
+        <w:t xml:space="preserve">To show the discovery is not a one-off, the same machinery was run on two further fixed textbook anchors. It generalises, reproduces, and discriminates:</w:t>
+      </w:r>
+    </w:p>
+    <w:tbl>
+      <w:tblPr>
+        <w:tblW w:type="dxa" w:w="9360"/>
+        <w:tblBorders>
+          <w:top w:val="single" w:color="auto" w:sz="4"/>
+          <w:left w:val="single" w:color="auto" w:sz="4"/>
+          <w:bottom w:val="single" w:color="auto" w:sz="4"/>
+          <w:right w:val="single" w:color="auto" w:sz="4"/>
+          <w:insideH w:val="single" w:color="auto" w:sz="4"/>
+          <w:insideV w:val="single" w:color="auto" w:sz="4"/>
+        </w:tblBorders>
+      </w:tblPr>
+      <w:tblGrid>
+        <w:gridCol w:w="1700"/>
+        <w:gridCol w:w="2300"/>
+        <w:gridCol w:w="1200"/>
+        <w:gridCol w:w="1200"/>
+        <w:gridCol w:w="2960"/>
+      </w:tblGrid>
+      <w:tr>
+        <w:trPr>
+          <w:tblHeader/>
+        </w:trPr>
+        <w:tc>
+          <w:tcPr>
+            <w:tcW w:type="dxa" w:w="1700"/>
+            <w:tcBorders>
+              <w:top w:val="single" w:color="BBBBBB" w:sz="1"/>
+              <w:left w:val="single" w:color="BBBBBB" w:sz="1"/>
+              <w:bottom w:val="single" w:color="BBBBBB" w:sz="1"/>
+              <w:right w:val="single" w:color="BBBBBB" w:sz="1"/>
+            </w:tcBorders>
+            <w:shd w:fill="1F3B5B" w:val="clear"/>
+            <w:tcMar>
+              <w:top w:type="dxa" w:w="80"/>
+              <w:left w:type="dxa" w:w="120"/>
+              <w:bottom w:type="dxa" w:w="80"/>
+              <w:right w:type="dxa" w:w="120"/>
+            </w:tcMar>
+          </w:tcPr>
+          <w:p>
+            <w:r>
+              <w:rPr>
+                <w:b/>
+                <w:bCs/>
+                <w:color w:val="FFFFFF"/>
+              </w:rPr>
+              <w:t xml:space="preserve">Endpoint</w:t>
+            </w:r>
+          </w:p>
+        </w:tc>
+        <w:tc>
+          <w:tcPr>
+            <w:tcW w:type="dxa" w:w="2300"/>
+            <w:tcBorders>
+              <w:top w:val="single" w:color="BBBBBB" w:sz="1"/>
+              <w:left w:val="single" w:color="BBBBBB" w:sz="1"/>
+              <w:bottom w:val="single" w:color="BBBBBB" w:sz="1"/>
+              <w:right w:val="single" w:color="BBBBBB" w:sz="1"/>
+            </w:tcBorders>
+            <w:shd w:fill="1F3B5B" w:val="clear"/>
+            <w:tcMar>
+              <w:top w:type="dxa" w:w="80"/>
+              <w:left w:type="dxa" w:w="120"/>
+              <w:bottom w:type="dxa" w:w="80"/>
+              <w:right w:type="dxa" w:w="120"/>
+            </w:tcMar>
+          </w:tcPr>
+          <w:p>
+            <w:r>
+              <w:rPr>
+                <w:b/>
+                <w:bCs/>
+                <w:color w:val="FFFFFF"/>
+              </w:rPr>
+              <w:t xml:space="preserve">Textbook anchor (0 params)</w:t>
+            </w:r>
+          </w:p>
+        </w:tc>
+        <w:tc>
+          <w:tcPr>
+            <w:tcW w:type="dxa" w:w="1200"/>
+            <w:tcBorders>
+              <w:top w:val="single" w:color="BBBBBB" w:sz="1"/>
+              <w:left w:val="single" w:color="BBBBBB" w:sz="1"/>
+              <w:bottom w:val="single" w:color="BBBBBB" w:sz="1"/>
+              <w:right w:val="single" w:color="BBBBBB" w:sz="1"/>
+            </w:tcBorders>
+            <w:shd w:fill="1F3B5B" w:val="clear"/>
+            <w:tcMar>
+              <w:top w:type="dxa" w:w="80"/>
+              <w:left w:type="dxa" w:w="120"/>
+              <w:bottom w:type="dxa" w:w="80"/>
+              <w:right w:type="dxa" w:w="120"/>
+            </w:tcMar>
+          </w:tcPr>
+          <w:p>
+            <w:r>
+              <w:rPr>
+                <w:b/>
+                <w:bCs/>
+                <w:color w:val="FFFFFF"/>
+              </w:rPr>
+              <w:t xml:space="preserve">anchor</w:t>
+            </w:r>
+          </w:p>
+        </w:tc>
+        <w:tc>
+          <w:tcPr>
+            <w:tcW w:type="dxa" w:w="1200"/>
+            <w:tcBorders>
+              <w:top w:val="single" w:color="BBBBBB" w:sz="1"/>
+              <w:left w:val="single" w:color="BBBBBB" w:sz="1"/>
+              <w:bottom w:val="single" w:color="BBBBBB" w:sz="1"/>
+              <w:right w:val="single" w:color="BBBBBB" w:sz="1"/>
+            </w:tcBorders>
+            <w:shd w:fill="1F3B5B" w:val="clear"/>
+            <w:tcMar>
+              <w:top w:type="dxa" w:w="80"/>
+              <w:left w:type="dxa" w:w="120"/>
+              <w:bottom w:type="dxa" w:w="80"/>
+              <w:right w:type="dxa" w:w="120"/>
+            </w:tcMar>
+          </w:tcPr>
+          <w:p>
+            <w:r>
+              <w:rPr>
+                <w:b/>
+                <w:bCs/>
+                <w:color w:val="FFFFFF"/>
+              </w:rPr>
+              <w:t xml:space="preserve">Δ data adds</w:t>
+            </w:r>
+          </w:p>
+        </w:tc>
+        <w:tc>
+          <w:tcPr>
+            <w:tcW w:type="dxa" w:w="2960"/>
+            <w:tcBorders>
+              <w:top w:val="single" w:color="BBBBBB" w:sz="1"/>
+              <w:left w:val="single" w:color="BBBBBB" w:sz="1"/>
+              <w:bottom w:val="single" w:color="BBBBBB" w:sz="1"/>
+              <w:right w:val="single" w:color="BBBBBB" w:sz="1"/>
+            </w:tcBorders>
+            <w:shd w:fill="1F3B5B" w:val="clear"/>
+            <w:tcMar>
+              <w:top w:type="dxa" w:w="80"/>
+              <w:left w:type="dxa" w:w="120"/>
+              <w:bottom w:type="dxa" w:w="80"/>
+              <w:right w:type="dxa" w:w="120"/>
+            </w:tcMar>
+          </w:tcPr>
+          <w:p>
+            <w:r>
+              <w:rPr>
+                <w:b/>
+                <w:bCs/>
+                <w:color w:val="FFFFFF"/>
+              </w:rPr>
+              <w:t xml:space="preserve">verdict</w:t>
+            </w:r>
+          </w:p>
+        </w:tc>
+      </w:tr>
+      <w:tr>
+        <w:tc>
+          <w:tcPr>
+            <w:tcW w:type="dxa" w:w="1700"/>
+            <w:tcBorders>
+              <w:top w:val="single" w:color="BBBBBB" w:sz="1"/>
+              <w:left w:val="single" w:color="BBBBBB" w:sz="1"/>
+              <w:bottom w:val="single" w:color="BBBBBB" w:sz="1"/>
+              <w:right w:val="single" w:color="BBBBBB" w:sz="1"/>
+            </w:tcBorders>
+            <w:shd w:fill="F4F8FB" w:val="clear"/>
+            <w:tcMar>
+              <w:top w:type="dxa" w:w="80"/>
+              <w:left w:type="dxa" w:w="120"/>
+              <w:bottom w:type="dxa" w:w="80"/>
+              <w:right w:type="dxa" w:w="120"/>
+            </w:tcMar>
+          </w:tcPr>
+          <w:p>
+            <w:r>
+              <w:rPr>
+                <w:b w:val="false"/>
+                <w:bCs w:val="false"/>
+              </w:rPr>
+              <w:t xml:space="preserve">LumA vs LumB</w:t>
+            </w:r>
+          </w:p>
+        </w:tc>
+        <w:tc>
+          <w:tcPr>
+            <w:tcW w:type="dxa" w:w="2300"/>
+            <w:tcBorders>
+              <w:top w:val="single" w:color="BBBBBB" w:sz="1"/>
+              <w:left w:val="single" w:color="BBBBBB" w:sz="1"/>
+              <w:bottom w:val="single" w:color="BBBBBB" w:sz="1"/>
+              <w:right w:val="single" w:color="BBBBBB" w:sz="1"/>
+            </w:tcBorders>
+            <w:shd w:fill="F4F8FB" w:val="clear"/>
+            <w:tcMar>
+              <w:top w:type="dxa" w:w="80"/>
+              <w:left w:type="dxa" w:w="120"/>
+              <w:bottom w:type="dxa" w:w="80"/>
+              <w:right w:type="dxa" w:w="120"/>
+            </w:tcMar>
+          </w:tcPr>
+          <w:p>
+            <w:r>
+              <w:rPr>
+                <w:b w:val="false"/>
+                <w:bCs w:val="false"/>
+              </w:rPr>
+              <w:t xml:space="preserve">proliferation index (20 genes)</w:t>
+            </w:r>
+          </w:p>
+        </w:tc>
+        <w:tc>
+          <w:tcPr>
+            <w:tcW w:type="dxa" w:w="1200"/>
+            <w:tcBorders>
+              <w:top w:val="single" w:color="BBBBBB" w:sz="1"/>
+              <w:left w:val="single" w:color="BBBBBB" w:sz="1"/>
+              <w:bottom w:val="single" w:color="BBBBBB" w:sz="1"/>
+              <w:right w:val="single" w:color="BBBBBB" w:sz="1"/>
+            </w:tcBorders>
+            <w:shd w:fill="F4F8FB" w:val="clear"/>
+            <w:tcMar>
+              <w:top w:type="dxa" w:w="80"/>
+              <w:left w:type="dxa" w:w="120"/>
+              <w:bottom w:type="dxa" w:w="80"/>
+              <w:right w:type="dxa" w:w="120"/>
+            </w:tcMar>
+          </w:tcPr>
+          <w:p>
+            <w:r>
+              <w:rPr>
+                <w:b w:val="false"/>
+                <w:bCs w:val="false"/>
+              </w:rPr>
+              <w:t xml:space="preserve">0.919</w:t>
+            </w:r>
+          </w:p>
+        </w:tc>
+        <w:tc>
+          <w:tcPr>
+            <w:tcW w:type="dxa" w:w="1200"/>
+            <w:tcBorders>
+              <w:top w:val="single" w:color="BBBBBB" w:sz="1"/>
+              <w:left w:val="single" w:color="BBBBBB" w:sz="1"/>
+              <w:bottom w:val="single" w:color="BBBBBB" w:sz="1"/>
+              <w:right w:val="single" w:color="BBBBBB" w:sz="1"/>
+            </w:tcBorders>
+            <w:shd w:fill="F4F8FB" w:val="clear"/>
+            <w:tcMar>
+              <w:top w:type="dxa" w:w="80"/>
+              <w:left w:type="dxa" w:w="120"/>
+              <w:bottom w:type="dxa" w:w="80"/>
+              <w:right w:type="dxa" w:w="120"/>
+            </w:tcMar>
+          </w:tcPr>
+          <w:p>
+            <w:r>
+              <w:rPr>
+                <w:b w:val="false"/>
+                <w:bCs w:val="false"/>
+              </w:rPr>
+              <w:t xml:space="preserve">+0.029</w:t>
+            </w:r>
+          </w:p>
+        </w:tc>
+        <w:tc>
+          <w:tcPr>
+            <w:tcW w:type="dxa" w:w="2960"/>
+            <w:tcBorders>
+              <w:top w:val="single" w:color="BBBBBB" w:sz="1"/>
+              <w:left w:val="single" w:color="BBBBBB" w:sz="1"/>
+              <w:bottom w:val="single" w:color="BBBBBB" w:sz="1"/>
+              <w:right w:val="single" w:color="BBBBBB" w:sz="1"/>
+            </w:tcBorders>
+            <w:shd w:fill="F4F8FB" w:val="clear"/>
+            <w:tcMar>
+              <w:top w:type="dxa" w:w="80"/>
+              <w:left w:type="dxa" w:w="120"/>
+              <w:bottom w:type="dxa" w:w="80"/>
+              <w:right w:type="dxa" w:w="120"/>
+            </w:tcMar>
+          </w:tcPr>
+          <w:p>
+            <w:r>
+              <w:rPr>
+                <w:b w:val="false"/>
+                <w:bCs w:val="false"/>
+              </w:rPr>
+              <w:t xml:space="preserve">incomplete → basal/lineage axis (verified)</w:t>
+            </w:r>
+          </w:p>
+        </w:tc>
+      </w:tr>
+      <w:tr>
+        <w:tc>
+          <w:tcPr>
+            <w:tcW w:type="dxa" w:w="1700"/>
+            <w:tcBorders>
+              <w:top w:val="single" w:color="BBBBBB" w:sz="1"/>
+              <w:left w:val="single" w:color="BBBBBB" w:sz="1"/>
+              <w:bottom w:val="single" w:color="BBBBBB" w:sz="1"/>
+              <w:right w:val="single" w:color="BBBBBB" w:sz="1"/>
+            </w:tcBorders>
+            <w:shd w:fill="F4F8FB" w:val="clear"/>
+            <w:tcMar>
+              <w:top w:type="dxa" w:w="80"/>
+              <w:left w:type="dxa" w:w="120"/>
+              <w:bottom w:type="dxa" w:w="80"/>
+              <w:right w:type="dxa" w:w="120"/>
+            </w:tcMar>
+          </w:tcPr>
+          <w:p>
+            <w:r>
+              <w:rPr>
+                <w:b w:val="false"/>
+                <w:bCs w:val="false"/>
+              </w:rPr>
+              <w:t xml:space="preserve">HER2 status</w:t>
+            </w:r>
+          </w:p>
+        </w:tc>
+        <w:tc>
+          <w:tcPr>
+            <w:tcW w:type="dxa" w:w="2300"/>
+            <w:tcBorders>
+              <w:top w:val="single" w:color="BBBBBB" w:sz="1"/>
+              <w:left w:val="single" w:color="BBBBBB" w:sz="1"/>
+              <w:bottom w:val="single" w:color="BBBBBB" w:sz="1"/>
+              <w:right w:val="single" w:color="BBBBBB" w:sz="1"/>
+            </w:tcBorders>
+            <w:shd w:fill="F4F8FB" w:val="clear"/>
+            <w:tcMar>
+              <w:top w:type="dxa" w:w="80"/>
+              <w:left w:type="dxa" w:w="120"/>
+              <w:bottom w:type="dxa" w:w="80"/>
+              <w:right w:type="dxa" w:w="120"/>
+            </w:tcMar>
+          </w:tcPr>
+          <w:p>
+            <w:r>
+              <w:rPr>
+                <w:b w:val="false"/>
+                <w:bCs w:val="false"/>
+              </w:rPr>
+              <w:t xml:space="preserve">ERBB2 amplicon (9 genes)</w:t>
+            </w:r>
+          </w:p>
+        </w:tc>
+        <w:tc>
+          <w:tcPr>
+            <w:tcW w:type="dxa" w:w="1200"/>
+            <w:tcBorders>
+              <w:top w:val="single" w:color="BBBBBB" w:sz="1"/>
+              <w:left w:val="single" w:color="BBBBBB" w:sz="1"/>
+              <w:bottom w:val="single" w:color="BBBBBB" w:sz="1"/>
+              <w:right w:val="single" w:color="BBBBBB" w:sz="1"/>
+            </w:tcBorders>
+            <w:shd w:fill="F4F8FB" w:val="clear"/>
+            <w:tcMar>
+              <w:top w:type="dxa" w:w="80"/>
+              <w:left w:type="dxa" w:w="120"/>
+              <w:bottom w:type="dxa" w:w="80"/>
+              <w:right w:type="dxa" w:w="120"/>
+            </w:tcMar>
+          </w:tcPr>
+          <w:p>
+            <w:r>
+              <w:rPr>
+                <w:b w:val="false"/>
+                <w:bCs w:val="false"/>
+              </w:rPr>
+              <w:t xml:space="preserve">0.752</w:t>
+            </w:r>
+          </w:p>
+        </w:tc>
+        <w:tc>
+          <w:tcPr>
+            <w:tcW w:type="dxa" w:w="1200"/>
+            <w:tcBorders>
+              <w:top w:val="single" w:color="BBBBBB" w:sz="1"/>
+              <w:left w:val="single" w:color="BBBBBB" w:sz="1"/>
+              <w:bottom w:val="single" w:color="BBBBBB" w:sz="1"/>
+              <w:right w:val="single" w:color="BBBBBB" w:sz="1"/>
+            </w:tcBorders>
+            <w:shd w:fill="F4F8FB" w:val="clear"/>
+            <w:tcMar>
+              <w:top w:type="dxa" w:w="80"/>
+              <w:left w:type="dxa" w:w="120"/>
+              <w:bottom w:type="dxa" w:w="80"/>
+              <w:right w:type="dxa" w:w="120"/>
+            </w:tcMar>
+          </w:tcPr>
+          <w:p>
+            <w:r>
+              <w:rPr>
+                <w:b w:val="false"/>
+                <w:bCs w:val="false"/>
+              </w:rPr>
+              <w:t xml:space="preserve">+0.054</w:t>
+            </w:r>
+          </w:p>
+        </w:tc>
+        <w:tc>
+          <w:tcPr>
+            <w:tcW w:type="dxa" w:w="2960"/>
+            <w:tcBorders>
+              <w:top w:val="single" w:color="BBBBBB" w:sz="1"/>
+              <w:left w:val="single" w:color="BBBBBB" w:sz="1"/>
+              <w:bottom w:val="single" w:color="BBBBBB" w:sz="1"/>
+              <w:right w:val="single" w:color="BBBBBB" w:sz="1"/>
+            </w:tcBorders>
+            <w:shd w:fill="F4F8FB" w:val="clear"/>
+            <w:tcMar>
+              <w:top w:type="dxa" w:w="80"/>
+              <w:left w:type="dxa" w:w="120"/>
+              <w:bottom w:type="dxa" w:w="80"/>
+              <w:right w:type="dxa" w:w="120"/>
+            </w:tcMar>
+          </w:tcPr>
+          <w:p>
+            <w:r>
+              <w:rPr>
+                <w:b w:val="false"/>
+                <w:bCs w:val="false"/>
+              </w:rPr>
+              <w:t xml:space="preserve">incomplete → neuroendocrine/immune axis (verified, ≠ basal)</w:t>
+            </w:r>
+          </w:p>
+        </w:tc>
+      </w:tr>
+      <w:tr>
+        <w:tc>
+          <w:tcPr>
+            <w:tcW w:type="dxa" w:w="1700"/>
+            <w:tcBorders>
+              <w:top w:val="single" w:color="BBBBBB" w:sz="1"/>
+              <w:left w:val="single" w:color="BBBBBB" w:sz="1"/>
+              <w:bottom w:val="single" w:color="BBBBBB" w:sz="1"/>
+              <w:right w:val="single" w:color="BBBBBB" w:sz="1"/>
+            </w:tcBorders>
+            <w:shd w:fill="F4F8FB" w:val="clear"/>
+            <w:tcMar>
+              <w:top w:type="dxa" w:w="80"/>
+              <w:left w:type="dxa" w:w="120"/>
+              <w:bottom w:type="dxa" w:w="80"/>
+              <w:right w:type="dxa" w:w="120"/>
+            </w:tcMar>
+          </w:tcPr>
+          <w:p>
+            <w:r>
+              <w:rPr>
+                <w:b w:val="false"/>
+                <w:bCs w:val="false"/>
+              </w:rPr>
+              <w:t xml:space="preserve">ER status</w:t>
+            </w:r>
+          </w:p>
+        </w:tc>
+        <w:tc>
+          <w:tcPr>
+            <w:tcW w:type="dxa" w:w="2300"/>
+            <w:tcBorders>
+              <w:top w:val="single" w:color="BBBBBB" w:sz="1"/>
+              <w:left w:val="single" w:color="BBBBBB" w:sz="1"/>
+              <w:bottom w:val="single" w:color="BBBBBB" w:sz="1"/>
+              <w:right w:val="single" w:color="BBBBBB" w:sz="1"/>
+            </w:tcBorders>
+            <w:shd w:fill="F4F8FB" w:val="clear"/>
+            <w:tcMar>
+              <w:top w:type="dxa" w:w="80"/>
+              <w:left w:type="dxa" w:w="120"/>
+              <w:bottom w:type="dxa" w:w="80"/>
+              <w:right w:type="dxa" w:w="120"/>
+            </w:tcMar>
+          </w:tcPr>
+          <w:p>
+            <w:r>
+              <w:rPr>
+                <w:b w:val="false"/>
+                <w:bCs w:val="false"/>
+              </w:rPr>
+              <w:t xml:space="preserve">ER/luminal signature (20 genes)</w:t>
+            </w:r>
+          </w:p>
+        </w:tc>
+        <w:tc>
+          <w:tcPr>
+            <w:tcW w:type="dxa" w:w="1200"/>
+            <w:tcBorders>
+              <w:top w:val="single" w:color="BBBBBB" w:sz="1"/>
+              <w:left w:val="single" w:color="BBBBBB" w:sz="1"/>
+              <w:bottom w:val="single" w:color="BBBBBB" w:sz="1"/>
+              <w:right w:val="single" w:color="BBBBBB" w:sz="1"/>
+            </w:tcBorders>
+            <w:shd w:fill="F4F8FB" w:val="clear"/>
+            <w:tcMar>
+              <w:top w:type="dxa" w:w="80"/>
+              <w:left w:type="dxa" w:w="120"/>
+              <w:bottom w:type="dxa" w:w="80"/>
+              <w:right w:type="dxa" w:w="120"/>
+            </w:tcMar>
+          </w:tcPr>
+          <w:p>
+            <w:r>
+              <w:rPr>
+                <w:b w:val="false"/>
+                <w:bCs w:val="false"/>
+              </w:rPr>
+              <w:t xml:space="preserve">0.938</w:t>
+            </w:r>
+          </w:p>
+        </w:tc>
+        <w:tc>
+          <w:tcPr>
+            <w:tcW w:type="dxa" w:w="1200"/>
+            <w:tcBorders>
+              <w:top w:val="single" w:color="BBBBBB" w:sz="1"/>
+              <w:left w:val="single" w:color="BBBBBB" w:sz="1"/>
+              <w:bottom w:val="single" w:color="BBBBBB" w:sz="1"/>
+              <w:right w:val="single" w:color="BBBBBB" w:sz="1"/>
+            </w:tcBorders>
+            <w:shd w:fill="F4F8FB" w:val="clear"/>
+            <w:tcMar>
+              <w:top w:type="dxa" w:w="80"/>
+              <w:left w:type="dxa" w:w="120"/>
+              <w:bottom w:type="dxa" w:w="80"/>
+              <w:right w:type="dxa" w:w="120"/>
+            </w:tcMar>
+          </w:tcPr>
+          <w:p>
+            <w:r>
+              <w:rPr>
+                <w:b w:val="false"/>
+                <w:bCs w:val="false"/>
+              </w:rPr>
+              <w:t xml:space="preserve">−0.001</w:t>
+            </w:r>
+          </w:p>
+        </w:tc>
+        <w:tc>
+          <w:tcPr>
+            <w:tcW w:type="dxa" w:w="2960"/>
+            <w:tcBorders>
+              <w:top w:val="single" w:color="BBBBBB" w:sz="1"/>
+              <w:left w:val="single" w:color="BBBBBB" w:sz="1"/>
+              <w:bottom w:val="single" w:color="BBBBBB" w:sz="1"/>
+              <w:right w:val="single" w:color="BBBBBB" w:sz="1"/>
+            </w:tcBorders>
+            <w:shd w:fill="F4F8FB" w:val="clear"/>
+            <w:tcMar>
+              <w:top w:type="dxa" w:w="80"/>
+              <w:left w:type="dxa" w:w="120"/>
+              <w:bottom w:type="dxa" w:w="80"/>
+              <w:right w:type="dxa" w:w="120"/>
+            </w:tcMar>
+          </w:tcPr>
+          <w:p>
+            <w:r>
+              <w:rPr>
+                <w:b w:val="false"/>
+                <w:bCs w:val="false"/>
+              </w:rPr>
+              <w:t xml:space="preserve">complete → no hidden axis (specificity)</w:t>
+            </w:r>
+          </w:p>
+        </w:tc>
+      </w:tr>
+    </w:tbl>
+    <w:p>
+      <w:pPr>
+        <w:spacing w:after="120"/>
+      </w:pPr>
+      <w:r>
+        <w:t xml:space="preserve">HER2 IHC status anchored on the ERBB2 17q12 amplicon (9 genes, zero trained parameters, n=808) is the second positive: the amplicon is INCOMPLETE (AUROC 0.752), so the method recovers a real, verified, anchor-orthogonal axis (delta +0.054; discovered panel +0.085 vs random +0.023, p=0.024; held-out positive in 8/8 splits; label-specific) -- a neuroendocrine/secretory + immune program (DOC2A, CAMK2B, NPW, RAMP1, BEX1, PCSK1N, SULT4A1, MS4A8B, AZU1, SEMA3D) DISTINCT from the LumA/B basal axis. By contrast ER status anchored on a textbook ER/luminal signature is COMPLETE (0.938) and genome-wide data adds about nothing (delta -0.001) -- the method correctly returns no hidden axis. So it makes a real, verified discovery a second time and finds a different, context-appropriate axis, while staying silent where the textbook already suffices: discovery where warranted, silence where not. Runners reports/dmoi_discovery_er.py and reports/dmoi_discovery_her2.py.</w:t>
       </w:r>
     </w:p>
     <w:sectPr>

</xml_diff>

<commit_message>
Close-out: bioRxiv-format manuscript (+figure), PyPI-ready packaging (v0.2.0), and NSCLC anti-PD1 cross-domain discovery
(a) reports/anchored_integration_manuscript.md/.pdf — full manuscript (abstract, intro, results,
    discussion, methods, data/code availability, references) + summary Figure 1 (figs/discovery_summary.png).
(b) pyproject.toml -> PyPI-ready metadata (authors, MIT license, classifiers, urls), version 0.2.0;
    omniomics.__version__ synced. Builds sdist+wheel cleanly; twine check PASSED (run python -m build to
    regenerate dist/, which stays gitignored).
(c) NSCLC anti-PD1 (MSK 2018) cross-domain generalization: anchor on textbook TMB -> residual recovers the
    other established IO biomarkers (PD-L1 orthogonal +; EGFR & STK11 resistance), panel d+0.061 vs random
    +0.006 (p=0.038). New runner, recorded CSVs, methods-note section, README row, and CI guard
    (test_nsclc_io_discovery_guard). Suite: 47 passed, 1 skipped.
</commit_message>
<xml_diff>
--- a/reports/GSE57577_2015_vs_2026_report.docx
+++ b/reports/GSE57577_2015_vs_2026_report.docx
@@ -11408,6 +11408,297 @@
       </w:pPr>
       <w:r>
         <w:t xml:space="preserve">HER2 IHC status anchored on the ERBB2 17q12 amplicon (9 genes, zero trained parameters, n=808) is the second positive: the amplicon is INCOMPLETE (AUROC 0.752), so the method recovers a real, verified, anchor-orthogonal axis (delta +0.054; discovered panel +0.085 vs random +0.023, p=0.024; held-out positive in 8/8 splits; label-specific) -- a neuroendocrine/secretory + immune program (DOC2A, CAMK2B, NPW, RAMP1, BEX1, PCSK1N, SULT4A1, MS4A8B, AZU1, SEMA3D) DISTINCT from the LumA/B basal axis. By contrast ER status anchored on a textbook ER/luminal signature is COMPLETE (0.938) and genome-wide data adds about nothing (delta -0.001) -- the method correctly returns no hidden axis. So it makes a real, verified discovery a second time and finds a different, context-appropriate axis, while staying silent where the textbook already suffices: discovery where warranted, silence where not. Runners reports/dmoi_discovery_er.py and reports/dmoi_discovery_her2.py.</w:t>
+      </w:r>
+    </w:p>
+    <w:p>
+      <w:pPr>
+        <w:pStyle w:val="Heading2"/>
+      </w:pPr>
+      <w:r>
+        <w:t xml:space="preserve">Appendix B (cont.) — External validation (METABRIC) and cross-domain generalization (NSCLC)</w:t>
+      </w:r>
+    </w:p>
+    <w:p>
+      <w:pPr>
+        <w:spacing w:after="120"/>
+      </w:pPr>
+      <w:r>
+        <w:t xml:space="preserve">Beyond the TCGA-BRCA discovery, the knowledge-anchored residual method was tested for reproducibility in an independent breast-cancer cohort (METABRIC) and for portability to a completely different domain (NSCLC immunotherapy). The headline: external reproducibility tracks biological coherence -- the pathway-enriched basal axis reproduces across cohorts, the diffuse HER2 residual is cohort-specific, and the method itself ports cleanly to a new disease, question and feature type.</w:t>
+      </w:r>
+    </w:p>
+    <w:tbl>
+      <w:tblPr>
+        <w:tblW w:type="dxa" w:w="9360"/>
+        <w:tblBorders>
+          <w:top w:val="single" w:color="auto" w:sz="4"/>
+          <w:left w:val="single" w:color="auto" w:sz="4"/>
+          <w:bottom w:val="single" w:color="auto" w:sz="4"/>
+          <w:right w:val="single" w:color="auto" w:sz="4"/>
+          <w:insideH w:val="single" w:color="auto" w:sz="4"/>
+          <w:insideV w:val="single" w:color="auto" w:sz="4"/>
+        </w:tblBorders>
+      </w:tblPr>
+      <w:tblGrid>
+        <w:gridCol w:w="2340"/>
+        <w:gridCol w:w="2340"/>
+        <w:gridCol w:w="2340"/>
+        <w:gridCol w:w="2340"/>
+      </w:tblGrid>
+      <w:tr>
+        <w:tc>
+          <w:tcPr>
+            <w:tcW w:type="dxa" w:w="2340"/>
+            <w:shd w:fill="1F3B5B" w:val="clear"/>
+          </w:tcPr>
+          <w:p>
+            <w:pPr>
+              <w:spacing w:after="0"/>
+            </w:pPr>
+            <w:r>
+              <w:rPr>
+                <w:b/>
+                <w:color w:val="FFFFFF"/>
+              </w:rPr>
+              <w:t xml:space="preserve">Test</w:t>
+            </w:r>
+          </w:p>
+        </w:tc>
+        <w:tc>
+          <w:tcPr>
+            <w:tcW w:type="dxa" w:w="2340"/>
+            <w:shd w:fill="1F3B5B" w:val="clear"/>
+          </w:tcPr>
+          <w:p>
+            <w:pPr>
+              <w:spacing w:after="0"/>
+            </w:pPr>
+            <w:r>
+              <w:rPr>
+                <w:b/>
+                <w:color w:val="FFFFFF"/>
+              </w:rPr>
+              <w:t xml:space="preserve">Cohort (n)</w:t>
+            </w:r>
+          </w:p>
+        </w:tc>
+        <w:tc>
+          <w:tcPr>
+            <w:tcW w:type="dxa" w:w="2340"/>
+            <w:shd w:fill="1F3B5B" w:val="clear"/>
+          </w:tcPr>
+          <w:p>
+            <w:pPr>
+              <w:spacing w:after="0"/>
+            </w:pPr>
+            <w:r>
+              <w:rPr>
+                <w:b/>
+                <w:color w:val="FFFFFF"/>
+              </w:rPr>
+              <w:t xml:space="preserve">Result</w:t>
+            </w:r>
+          </w:p>
+        </w:tc>
+        <w:tc>
+          <w:tcPr>
+            <w:tcW w:type="dxa" w:w="2340"/>
+            <w:shd w:fill="1F3B5B" w:val="clear"/>
+          </w:tcPr>
+          <w:p>
+            <w:pPr>
+              <w:spacing w:after="0"/>
+            </w:pPr>
+            <w:r>
+              <w:rPr>
+                <w:b/>
+                <w:color w:val="FFFFFF"/>
+              </w:rPr>
+              <w:t xml:space="preserve">Verdict</w:t>
+            </w:r>
+          </w:p>
+        </w:tc>
+      </w:tr>
+      <w:tr>
+        <w:tc>
+          <w:tcPr>
+            <w:tcW w:type="dxa" w:w="2340"/>
+            <w:shd w:fill="F4F8FB" w:val="clear"/>
+          </w:tcPr>
+          <w:p>
+            <w:pPr>
+              <w:spacing w:after="0"/>
+            </w:pPr>
+            <w:r>
+              <w:t xml:space="preserve">Basal axis replication</w:t>
+            </w:r>
+          </w:p>
+        </w:tc>
+        <w:tc>
+          <w:tcPr>
+            <w:tcW w:type="dxa" w:w="2340"/>
+            <w:shd w:fill="F4F8FB" w:val="clear"/>
+          </w:tcPr>
+          <w:p>
+            <w:pPr>
+              <w:spacing w:after="0"/>
+            </w:pPr>
+            <w:r>
+              <w:t xml:space="preserve">METABRIC ~1900</w:t>
+            </w:r>
+          </w:p>
+        </w:tc>
+        <w:tc>
+          <w:tcPr>
+            <w:tcW w:type="dxa" w:w="2340"/>
+            <w:shd w:fill="F4F8FB" w:val="clear"/>
+          </w:tcPr>
+          <w:p>
+            <w:pPr>
+              <w:spacing w:after="0"/>
+            </w:pPr>
+            <w:r>
+              <w:t xml:space="preserve">TCGA basal panel adds delta +0.036 over the proliferation anchor (beats random panels, p=0.048); an unbiased re-discovery overlaps the TCGA panel 20/30 (hypergeometric p ~ 7e-27)</w:t>
+            </w:r>
+          </w:p>
+        </w:tc>
+        <w:tc>
+          <w:tcPr>
+            <w:tcW w:type="dxa" w:w="2340"/>
+            <w:shd w:fill="F4F8FB" w:val="clear"/>
+          </w:tcPr>
+          <w:p>
+            <w:pPr>
+              <w:spacing w:after="0"/>
+            </w:pPr>
+            <w:r>
+              <w:t xml:space="preserve">REPRODUCES</w:t>
+            </w:r>
+          </w:p>
+        </w:tc>
+      </w:tr>
+      <w:tr>
+        <w:tc>
+          <w:tcPr>
+            <w:tcW w:type="dxa" w:w="2340"/>
+            <w:shd w:fill="F4F8FB" w:val="clear"/>
+          </w:tcPr>
+          <w:p>
+            <w:pPr>
+              <w:spacing w:after="0"/>
+            </w:pPr>
+            <w:r>
+              <w:t xml:space="preserve">HER2 axis replication</w:t>
+            </w:r>
+          </w:p>
+        </w:tc>
+        <w:tc>
+          <w:tcPr>
+            <w:tcW w:type="dxa" w:w="2340"/>
+            <w:shd w:fill="F4F8FB" w:val="clear"/>
+          </w:tcPr>
+          <w:p>
+            <w:pPr>
+              <w:spacing w:after="0"/>
+            </w:pPr>
+            <w:r>
+              <w:t xml:space="preserve">METABRIC 1980</w:t>
+            </w:r>
+          </w:p>
+        </w:tc>
+        <w:tc>
+          <w:tcPr>
+            <w:tcW w:type="dxa" w:w="2340"/>
+            <w:shd w:fill="F4F8FB" w:val="clear"/>
+          </w:tcPr>
+          <w:p>
+            <w:pPr>
+              <w:spacing w:after="0"/>
+            </w:pPr>
+            <w:r>
+              <w:t xml:space="preserve">amplicon anchor near-complete here (AUROC 0.997 vs 0.752 in TCGA) so no residual exists; TCGA HER2 panel adds delta ~0; re-discovery overlap 2/30</w:t>
+            </w:r>
+          </w:p>
+        </w:tc>
+        <w:tc>
+          <w:tcPr>
+            <w:tcW w:type="dxa" w:w="2340"/>
+            <w:shd w:fill="F4F8FB" w:val="clear"/>
+          </w:tcPr>
+          <w:p>
+            <w:pPr>
+              <w:spacing w:after="0"/>
+            </w:pPr>
+            <w:r>
+              <w:t xml:space="preserve">cohort-specific (interpretable negative)</w:t>
+            </w:r>
+          </w:p>
+        </w:tc>
+      </w:tr>
+      <w:tr>
+        <w:tc>
+          <w:tcPr>
+            <w:tcW w:type="dxa" w:w="2340"/>
+            <w:shd w:fill="F4F8FB" w:val="clear"/>
+          </w:tcPr>
+          <w:p>
+            <w:pPr>
+              <w:spacing w:after="0"/>
+            </w:pPr>
+            <w:r>
+              <w:t xml:space="preserve">Cross-domain generalization</w:t>
+            </w:r>
+          </w:p>
+        </w:tc>
+        <w:tc>
+          <w:tcPr>
+            <w:tcW w:type="dxa" w:w="2340"/>
+            <w:shd w:fill="F4F8FB" w:val="clear"/>
+          </w:tcPr>
+          <w:p>
+            <w:pPr>
+              <w:spacing w:after="0"/>
+            </w:pPr>
+            <w:r>
+              <w:t xml:space="preserve">NSCLC anti-PD1, MSK 2018 (227)</w:t>
+            </w:r>
+          </w:p>
+        </w:tc>
+        <w:tc>
+          <w:tcPr>
+            <w:tcW w:type="dxa" w:w="2340"/>
+            <w:shd w:fill="F4F8FB" w:val="clear"/>
+          </w:tcPr>
+          <w:p>
+            <w:pPr>
+              <w:spacing w:after="0"/>
+            </w:pPr>
+            <w:r>
+              <w:t xml:space="preserve">a different cancer, question and feature type: anchored on the textbook biomarker TMB, the residual recovers the other established IO biomarkers -- PD-L1 (orthogonal to TMB), EGFR and STK11 mutation (resistance); panel delta +0.061 vs random +0.006 (p=0.038)</w:t>
+            </w:r>
+          </w:p>
+        </w:tc>
+        <w:tc>
+          <w:tcPr>
+            <w:tcW w:type="dxa" w:w="2340"/>
+            <w:shd w:fill="F4F8FB" w:val="clear"/>
+          </w:tcPr>
+          <w:p>
+            <w:pPr>
+              <w:spacing w:after="0"/>
+            </w:pPr>
+            <w:r>
+              <w:t xml:space="preserve">GENERALIZES</w:t>
+            </w:r>
+          </w:p>
+        </w:tc>
+      </w:tr>
+    </w:tbl>
+    <w:p>
+      <w:pPr>
+        <w:spacing w:after="160"/>
+      </w:pPr>
+      <w:r>
+        <w:t xml:space="preserve">Interpretation. The basal/keratinization axis -- a coherent, pathway-enriched program -- reproduces in a second cohort with an independent re-discovery recovering the same genes, while the HER2 residual does not, precisely because METABRIC's HER2 calls are amplification-concordant enough that the textbook amplicon anchor is already complete (no residual to find). On NSCLC anti-PD1 data the same procedure, anchored on the textbook TMB biomarker, rediscovers the field's other known biomarkers (PD-L1, EGFR, STK11), confirming the method is neither breast-cancer- nor expression-specific. Runners: reports/dmoi_external_metabric.py, reports/dmoi_external_her2_metabric.py, reports/dmoi_discovery_nsclc_io.py. Full write-up: reports/anchored_integration_methods.md; manuscript: reports/anchored_integration_manuscript.pdf.</w:t>
       </w:r>
     </w:p>
     <w:sectPr>

</xml_diff>

<commit_message>
Cross-cancer external validation: breast basal/keratinization axis re-discovers in TCGA lung
TCGA lung carcinoma (LUAD adeno vs LUSC squamous, n=1129, UCSC Xena HiSeqV2). Anchored on the SAME
zero-parameter proliferation signature (AUROC 0.77 for histology = incomplete), the residual discovery
recovers the squamous/keratinization axis and overlaps the breast basal panel 10/30 (KRT5/14/6B, TP63,
DSG3/DSC3, FAT2, CALML3, ANXA8, TRIM29), hypergeometric p~3e-16 -- the discovered biology re-appears in a
different cancer, not a cohort artefact. Honest caveat recorded: the panel-vs-random delta control saturates
(p~0.18) because squamous-vs-adeno is a near-trivial transcriptomic split, so gene-level overlap is the
informative metric here. New runner (downloads Xena on demand), recorded CSVs, methods-note section, README
row, and CI guard (test_external_lung_guard). Suite: 48 passed, 1 skipped.
</commit_message>
<xml_diff>
--- a/reports/GSE57577_2015_vs_2026_report.docx
+++ b/reports/GSE57577_2015_vs_2026_report.docx
@@ -11688,6 +11688,64 @@
             </w:pPr>
             <w:r>
               <w:t xml:space="preserve">GENERALIZES</w:t>
+            </w:r>
+          </w:p>
+        </w:tc>
+      </w:tr>
+      <w:tr>
+        <w:tc>
+          <w:tcPr>
+            <w:tcW w:type="dxa" w:w="2340"/>
+            <w:shd w:fill="F4F8FB" w:val="clear"/>
+          </w:tcPr>
+          <w:p>
+            <w:pPr>
+              <w:spacing w:after="0"/>
+            </w:pPr>
+            <w:r>
+              <w:t xml:space="preserve">Cross-cancer replication</w:t>
+            </w:r>
+          </w:p>
+        </w:tc>
+        <w:tc>
+          <w:tcPr>
+            <w:tcW w:type="dxa" w:w="2340"/>
+            <w:shd w:fill="F4F8FB" w:val="clear"/>
+          </w:tcPr>
+          <w:p>
+            <w:pPr>
+              <w:spacing w:after="0"/>
+            </w:pPr>
+            <w:r>
+              <w:t xml:space="preserve">TCGA lung LUAD vs LUSC (1129)</w:t>
+            </w:r>
+          </w:p>
+        </w:tc>
+        <w:tc>
+          <w:tcPr>
+            <w:tcW w:type="dxa" w:w="2340"/>
+            <w:shd w:fill="F4F8FB" w:val="clear"/>
+          </w:tcPr>
+          <w:p>
+            <w:pPr>
+              <w:spacing w:after="0"/>
+            </w:pPr>
+            <w:r>
+              <w:t xml:space="preserve">the breast basal/keratinization axis re-discovers in a different cancer: anchored on the SAME proliferation signature, the lung-squamous residual overlaps the breast basal panel 10/30 (KRT5, KRT14, KRT6B, TP63, DSG3, DSC3, FAT2, CALML3, ANXA8, TRIM29), hypergeometric p ~ 3e-16. Caveat: panel-vs-random saturates (squamous-vs-adeno is a near-trivial split) so gene-level overlap is the informative metric</w:t>
+            </w:r>
+          </w:p>
+        </w:tc>
+        <w:tc>
+          <w:tcPr>
+            <w:tcW w:type="dxa" w:w="2340"/>
+            <w:shd w:fill="F4F8FB" w:val="clear"/>
+          </w:tcPr>
+          <w:p>
+            <w:pPr>
+              <w:spacing w:after="0"/>
+            </w:pPr>
+            <w:r>
+              <w:t xml:space="preserve">REPLICATES (discovered biology, not a cohort artefact)</w:t>
             </w:r>
           </w:p>
         </w:tc>

</xml_diff>